<commit_message>
Describe study population without 'first ablation'; correct grade-override overlap (366 of 372)
The study population is no longer restricted to first ablations; the
baseline phenotype set is one admission per patient (first ablation
admission in the study period). Paired-analysis grades replaced the
extracted grades only for the 366 patients whose baseline-set admission
was a paired procedure. Script 74 now fills a missing 患者唯一号 from the
archive by 登记号 before falling back to 登记号.

Co-Authored-By: Claude Opus 5.5 <noreply@anthropic.com>
Claude-Session: https://claude.ai/code/session_01DvcujGbPquM9swTytkBBuK
</commit_message>
<xml_diff>
--- a/E30/Early_Hemodynamic_Reversal_Europace_E30_clean.docx
+++ b/E30/Early_Hemodynamic_Reversal_Europace_E30_clean.docx
@@ -558,7 +558,7 @@
           <w:bCs/>
           <w:color w:val="1B1C1D"/>
         </w:rPr>
-        <w:t xml:space="preserve">766</w:t>
+        <w:t xml:space="preserve">782</w:t>
       </w:r>
       <w:r>
         <w:rPr>
@@ -1507,7 +1507,283 @@
           <w:kern w:val="0"/>
           <w:lang w:bidi="ar"/>
         </w:rPr>
-        <w:t xml:space="preserve">This single-center retrospective study at West China Hospital, Sichuan University, included adults (age ≥18 years) undergoing AF ablation between January 2020 and September 2024 whose index admission included an in-hospital baseline transthoracic echocardiography (TTE) report (n=3,682). After uniform exclusion of prior or concurrent valve surgery (n=74), organic valve disease (n=30), congenital heart disease (n=19), and obstructive hypertrophic cardiomyopathy (n=8), the study population comprised 3,551 patients (Figure 1). Two analysis sets addressed complementary questions: a baseline phenotype set of 3,045 patients characterized regurgitation burden and coexistence, and a paired response set of 844 procedures in 837 patients assessed 1-month improvement; 372 patients belonged to both sets. Paroxysmal and persistent AF were analyzed separately within each set using common definitions.</w:t>
+        <w:t xml:space="preserve">This single-center retrospective study</w:t>
+      </w:r>
+      <w:r>
+        <w:rPr>
+          <w:rFonts w:ascii="Times New Roman" w:eastAsia="宋体" w:hAnsi="Times New Roman" w:cs="Times New Roman"/>
+        </w:rPr>
+        <w:t xml:space="preserve"> at West China Hospital, Sichuan University,</w:t>
+      </w:r>
+      <w:r>
+        <w:rPr>
+          <w:rFonts w:ascii="Times New Roman" w:eastAsia="Times New Roman" w:hAnsi="Times New Roman" w:cs="Times New Roman" w:hint="eastAsia"/>
+          <w:color w:val="1B1C1D"/>
+          <w:kern w:val="0"/>
+          <w:lang w:bidi="ar"/>
+        </w:rPr>
+        <w:t xml:space="preserve"> included adults (age ≥18 years) undergoing AF ablation between January 2020 and September </w:t>
+      </w:r>
+      <w:r>
+        <w:rPr>
+          <w:rFonts w:ascii="Times New Roman" w:eastAsia="Times New Roman" w:hAnsi="Times New Roman" w:cs="Times New Roman" w:hint="eastAsia"/>
+          <w:color w:val="1B1C1D"/>
+          <w:kern w:val="0"/>
+          <w:lang w:bidi="ar"/>
+        </w:rPr>
+        <w:t xml:space="preserve">2024 with an in-hospital baseline transthoracic echocardiography (TTE) report (n=3,682). After uniform exclusion of prior or concurrent valve surgery (n=74), organic valve disease (n=30), congenital heart disease (n=19), and obstructive hypertrophic cardiomyopathy (n=8), the study population comprised 3,551 patients (Figure 1).</w:t>
+      </w:r>
+      <w:r>
+        <w:rPr>
+          <w:rFonts w:ascii="Times New Roman" w:eastAsia="Times New Roman" w:hAnsi="Times New Roman" w:cs="Times New Roman" w:hint="eastAsia"/>
+          <w:color w:val="1B1C1D"/>
+          <w:kern w:val="0"/>
+          <w:lang w:bidi="ar"/>
+        </w:rPr>
+        <w:t xml:space="preserve"> Two </w:t>
+      </w:r>
+      <w:r>
+        <w:rPr>
+          <w:rFonts w:ascii="Times New Roman" w:eastAsia="Times New Roman" w:hAnsi="Times New Roman" w:cs="Times New Roman" w:hint="eastAsia"/>
+          <w:color w:val="1B1C1D"/>
+          <w:kern w:val="0"/>
+          <w:lang w:bidi="ar"/>
+        </w:rPr>
+        <w:t xml:space="preserve">analysis</w:t>
+      </w:r>
+      <w:r>
+        <w:rPr>
+          <w:rFonts w:ascii="Times New Roman" w:eastAsia="Times New Roman" w:hAnsi="Times New Roman" w:cs="Times New Roman" w:hint="eastAsia"/>
+          <w:color w:val="1B1C1D"/>
+          <w:kern w:val="0"/>
+          <w:lang w:bidi="ar"/>
+        </w:rPr>
+        <w:t xml:space="preserve"> </w:t>
+      </w:r>
+      <w:r>
+        <w:rPr>
+          <w:rFonts w:ascii="Times New Roman" w:eastAsia="Times New Roman" w:hAnsi="Times New Roman" w:cs="Times New Roman" w:hint="eastAsia"/>
+          <w:color w:val="1B1C1D"/>
+          <w:kern w:val="0"/>
+          <w:lang w:bidi="ar"/>
+        </w:rPr>
+        <w:t xml:space="preserve">sets</w:t>
+      </w:r>
+      <w:r>
+        <w:rPr>
+          <w:rFonts w:ascii="Times New Roman" w:eastAsia="Times New Roman" w:hAnsi="Times New Roman" w:cs="Times New Roman" w:hint="eastAsia"/>
+          <w:color w:val="1B1C1D"/>
+          <w:kern w:val="0"/>
+          <w:lang w:bidi="ar"/>
+        </w:rPr>
+        <w:t xml:space="preserve"> addressed complementary questions</w:t>
+      </w:r>
+      <w:r>
+        <w:rPr>
+          <w:rFonts w:ascii="Times New Roman" w:eastAsia="Times New Roman" w:hAnsi="Times New Roman" w:cs="Times New Roman"/>
+          <w:color w:val="1B1C1D"/>
+          <w:kern w:val="0"/>
+          <w:lang w:bidi="ar"/>
+        </w:rPr>
+        <w:t xml:space="preserve">: a baseline phenotype </w:t>
+      </w:r>
+      <w:r>
+        <w:rPr>
+          <w:rFonts w:ascii="Times New Roman" w:eastAsia="Times New Roman" w:hAnsi="Times New Roman" w:cs="Times New Roman"/>
+          <w:color w:val="1B1C1D"/>
+          <w:kern w:val="0"/>
+          <w:lang w:bidi="ar"/>
+        </w:rPr>
+        <w:t xml:space="preserve">set</w:t>
+      </w:r>
+      <w:r>
+        <w:rPr>
+          <w:rFonts w:ascii="Times New Roman" w:eastAsia="Times New Roman" w:hAnsi="Times New Roman" w:cs="Times New Roman"/>
+          <w:color w:val="1B1C1D"/>
+          <w:kern w:val="0"/>
+          <w:lang w:bidi="ar"/>
+        </w:rPr>
+        <w:t xml:space="preserve"> of </w:t>
+      </w:r>
+      <w:r>
+        <w:rPr>
+          <w:rFonts w:ascii="Times New Roman" w:eastAsia="Times New Roman" w:hAnsi="Times New Roman" w:cs="Times New Roman"/>
+          <w:color w:val="1B1C1D"/>
+          <w:kern w:val="0"/>
+          <w:lang w:bidi="ar"/>
+        </w:rPr>
+        <w:t xml:space="preserve">3</w:t>
+      </w:r>
+      <w:r>
+        <w:rPr>
+          <w:rFonts w:ascii="Times New Roman" w:eastAsia="Times New Roman" w:hAnsi="Times New Roman" w:cs="Times New Roman"/>
+          <w:color w:val="1B1C1D"/>
+          <w:kern w:val="0"/>
+          <w:lang w:bidi="ar"/>
+        </w:rPr>
+        <w:t xml:space="preserve">,</w:t>
+      </w:r>
+      <w:r>
+        <w:rPr>
+          <w:rFonts w:ascii="Times New Roman" w:eastAsia="Times New Roman" w:hAnsi="Times New Roman" w:cs="Times New Roman"/>
+          <w:color w:val="1B1C1D"/>
+          <w:kern w:val="0"/>
+          <w:lang w:bidi="ar"/>
+        </w:rPr>
+        <w:t xml:space="preserve">045</w:t>
+      </w:r>
+      <w:r>
+        <w:rPr>
+          <w:rFonts w:ascii="Times New Roman" w:eastAsia="Times New Roman" w:hAnsi="Times New Roman" w:cs="Times New Roman"/>
+          <w:color w:val="1B1C1D"/>
+          <w:kern w:val="0"/>
+          <w:lang w:bidi="ar"/>
+        </w:rPr>
+        <w:t xml:space="preserve"> patients characterized regurgitation burden and coexistence, and a paired response </w:t>
+      </w:r>
+      <w:r>
+        <w:rPr>
+          <w:rFonts w:ascii="Times New Roman" w:eastAsia="Times New Roman" w:hAnsi="Times New Roman" w:cs="Times New Roman"/>
+          <w:color w:val="1B1C1D"/>
+          <w:kern w:val="0"/>
+          <w:lang w:bidi="ar"/>
+        </w:rPr>
+        <w:t xml:space="preserve">set</w:t>
+      </w:r>
+      <w:r>
+        <w:rPr>
+          <w:rFonts w:ascii="Times New Roman" w:eastAsia="Times New Roman" w:hAnsi="Times New Roman" w:cs="Times New Roman"/>
+          <w:color w:val="1B1C1D"/>
+          <w:kern w:val="0"/>
+          <w:lang w:bidi="ar"/>
+        </w:rPr>
+        <w:t xml:space="preserve"> of 844 procedures in 837 patients assessed 1-month </w:t>
+      </w:r>
+      <w:r>
+        <w:rPr>
+          <w:rFonts w:ascii="Times New Roman" w:eastAsia="Times New Roman" w:hAnsi="Times New Roman" w:cs="Times New Roman"/>
+          <w:color w:val="1B1C1D"/>
+          <w:kern w:val="0"/>
+          <w:lang w:bidi="ar"/>
+        </w:rPr>
+        <w:t xml:space="preserve">improvement;</w:t>
+      </w:r>
+      <w:r>
+        <w:rPr>
+          <w:rFonts w:ascii="Times New Roman" w:eastAsia="Times New Roman" w:hAnsi="Times New Roman" w:cs="Times New Roman"/>
+          <w:color w:val="1B1C1D"/>
+          <w:kern w:val="0"/>
+          <w:lang w:bidi="ar"/>
+        </w:rPr>
+        <w:t xml:space="preserve"> </w:t>
+      </w:r>
+      <w:r>
+        <w:rPr>
+          <w:rFonts w:ascii="Times New Roman" w:eastAsia="Times New Roman" w:hAnsi="Times New Roman" w:cs="Times New Roman"/>
+          <w:color w:val="1B1C1D"/>
+          <w:kern w:val="0"/>
+          <w:lang w:bidi="ar"/>
+        </w:rPr>
+        <w:t xml:space="preserve">372</w:t>
+      </w:r>
+      <w:r>
+        <w:rPr>
+          <w:rFonts w:ascii="Times New Roman" w:eastAsia="Times New Roman" w:hAnsi="Times New Roman" w:cs="Times New Roman"/>
+          <w:color w:val="1B1C1D"/>
+          <w:kern w:val="0"/>
+          <w:lang w:bidi="ar"/>
+        </w:rPr>
+        <w:t xml:space="preserve"> patients </w:t>
+      </w:r>
+      <w:r>
+        <w:rPr>
+          <w:rFonts w:ascii="Times New Roman" w:eastAsia="Times New Roman" w:hAnsi="Times New Roman" w:cs="Times New Roman"/>
+          <w:color w:val="1B1C1D"/>
+          <w:kern w:val="0"/>
+          <w:lang w:bidi="ar"/>
+        </w:rPr>
+        <w:t xml:space="preserve">belonged</w:t>
+      </w:r>
+      <w:r>
+        <w:rPr>
+          <w:rFonts w:ascii="Times New Roman" w:eastAsia="Times New Roman" w:hAnsi="Times New Roman" w:cs="Times New Roman"/>
+          <w:color w:val="1B1C1D"/>
+          <w:kern w:val="0"/>
+          <w:lang w:bidi="ar"/>
+        </w:rPr>
+        <w:t xml:space="preserve"> </w:t>
+      </w:r>
+      <w:r>
+        <w:rPr>
+          <w:rFonts w:ascii="Times New Roman" w:eastAsia="Times New Roman" w:hAnsi="Times New Roman" w:cs="Times New Roman"/>
+          <w:color w:val="1B1C1D"/>
+          <w:kern w:val="0"/>
+          <w:lang w:bidi="ar"/>
+        </w:rPr>
+        <w:t xml:space="preserve">to</w:t>
+      </w:r>
+      <w:r>
+        <w:rPr>
+          <w:rFonts w:ascii="Times New Roman" w:eastAsia="Times New Roman" w:hAnsi="Times New Roman" w:cs="Times New Roman"/>
+          <w:color w:val="1B1C1D"/>
+          <w:kern w:val="0"/>
+          <w:lang w:bidi="ar"/>
+        </w:rPr>
+        <w:t xml:space="preserve"> </w:t>
+      </w:r>
+      <w:r>
+        <w:rPr>
+          <w:rFonts w:ascii="Times New Roman" w:eastAsia="Times New Roman" w:hAnsi="Times New Roman" w:cs="Times New Roman"/>
+          <w:color w:val="1B1C1D"/>
+          <w:kern w:val="0"/>
+          <w:lang w:bidi="ar"/>
+        </w:rPr>
+        <w:t xml:space="preserve">both</w:t>
+      </w:r>
+      <w:r>
+        <w:rPr>
+          <w:rFonts w:ascii="Times New Roman" w:eastAsia="Times New Roman" w:hAnsi="Times New Roman" w:cs="Times New Roman"/>
+          <w:color w:val="1B1C1D"/>
+          <w:kern w:val="0"/>
+          <w:lang w:bidi="ar"/>
+        </w:rPr>
+        <w:t xml:space="preserve"> </w:t>
+      </w:r>
+      <w:r>
+        <w:rPr>
+          <w:rFonts w:ascii="Times New Roman" w:eastAsia="Times New Roman" w:hAnsi="Times New Roman" w:cs="Times New Roman"/>
+          <w:color w:val="1B1C1D"/>
+          <w:kern w:val="0"/>
+          <w:lang w:bidi="ar"/>
+        </w:rPr>
+        <w:t xml:space="preserve">sets.</w:t>
+      </w:r>
+      <w:r>
+        <w:rPr>
+          <w:rFonts w:ascii="Times New Roman" w:eastAsia="Times New Roman" w:hAnsi="Times New Roman" w:cs="Times New Roman"/>
+          <w:color w:val="1B1C1D"/>
+          <w:kern w:val="0"/>
+          <w:lang w:bidi="ar"/>
+        </w:rPr>
+        <w:t xml:space="preserve"> Paroxysmal and persistent AF were analyzed separately within each </w:t>
+      </w:r>
+      <w:r>
+        <w:rPr>
+          <w:rFonts w:ascii="Times New Roman" w:eastAsia="Times New Roman" w:hAnsi="Times New Roman" w:cs="Times New Roman"/>
+          <w:color w:val="1B1C1D"/>
+          <w:kern w:val="0"/>
+          <w:lang w:bidi="ar"/>
+        </w:rPr>
+        <w:t xml:space="preserve">set</w:t>
+      </w:r>
+      <w:r>
+        <w:rPr>
+          <w:rFonts w:ascii="Times New Roman" w:eastAsia="Times New Roman" w:hAnsi="Times New Roman" w:cs="Times New Roman"/>
+          <w:color w:val="1B1C1D"/>
+          <w:kern w:val="0"/>
+          <w:lang w:bidi="ar"/>
+        </w:rPr>
+        <w:t xml:space="preserve"> using common definitions.</w:t>
       </w:r>
     </w:p>
     <w:p>
@@ -1527,7 +1803,7 @@
           <w:kern w:val="0"/>
           <w:lang w:bidi="ar"/>
         </w:rPr>
-        <w:t xml:space="preserve">In the baseline phenotype set, MR and TR grades were extracted from the TTE report of the index admission (weighted κ against manual abstraction, 0.96–0.97), and patients were classified as having neither valve, MR only, TR only, or both affected (analysis grade ≥1; Supplementary Table S1A). Registry grades were recorded only for patients with regurgitation and were not used to estimate prevalence.</w:t>
+        <w:t xml:space="preserve">The baseline phenotype set included one admission per patient, the first ablation admission in the study period; MR and TR grades were extracted from its TTE report (weighted κ against manual abstraction, 0.96–0.97), and patients were classified as having neither valve, MR only, TR only, or both affected (analysis grade ≥1; Supplementary Table S1A). Registry grades were recorded only for patients with regurgitation and were not used to estimate prevalence.</w:t>
       </w:r>
     </w:p>
     <w:p>
@@ -1763,16 +2039,34 @@
           <w:kern w:val="0"/>
           <w:lang w:bidi="ar"/>
         </w:rPr>
-        <w:t xml:space="preserve"> comprised 844 procedures in 837 patients: isolated MR (n=132), isolated TR (n=325), and combined MR/TR (n=387). Seven patients underwent two ablations, with each procedure analyzed separately. For the </w:t>
-      </w:r>
-      <w:r>
-        <w:rPr>
-          <w:rFonts w:ascii="Times New Roman" w:eastAsia="Times New Roman" w:hAnsi="Times New Roman" w:cs="Times New Roman"/>
-          <w:color w:val="1B1C1D"/>
-          <w:kern w:val="0"/>
-          <w:lang w:bidi="ar"/>
-        </w:rPr>
-        <w:t xml:space="preserve">372</w:t>
+        <w:t xml:space="preserve"> comprised 844 procedures in 837 patients: isolated MR (n=132), isolated TR (n=325), and combined MR/TR (n=387). Seven patients underwent two ablations, with each procedure analyzed separately. </w:t>
+      </w:r>
+      <w:r>
+        <w:rPr>
+          <w:rFonts w:ascii="Times New Roman" w:eastAsia="Times New Roman" w:hAnsi="Times New Roman" w:cs="Times New Roman"/>
+          <w:color w:val="1B1C1D"/>
+          <w:kern w:val="0"/>
+          <w:lang w:bidi="ar"/>
+        </w:rPr>
+        <w:t xml:space="preserve">When</w:t>
+      </w:r>
+      <w:r>
+        <w:rPr>
+          <w:rFonts w:ascii="Times New Roman" w:eastAsia="Times New Roman" w:hAnsi="Times New Roman" w:cs="Times New Roman"/>
+          <w:color w:val="1B1C1D"/>
+          <w:kern w:val="0"/>
+          <w:lang w:bidi="ar"/>
+        </w:rPr>
+        <w:t xml:space="preserve"> the </w:t>
+      </w:r>
+      <w:r>
+        <w:rPr>
+          <w:rFonts w:ascii="Times New Roman" w:eastAsia="Times New Roman" w:hAnsi="Times New Roman" w:cs="Times New Roman"/>
+          <w:color w:val="1B1C1D"/>
+          <w:kern w:val="0"/>
+          <w:lang w:bidi="ar"/>
+        </w:rPr>
+        <w:t xml:space="preserve">baseline-set admission was itself a paired procedure (366 of the 372</w:t>
       </w:r>
       <w:r>
         <w:rPr>
@@ -1826,25 +2120,25 @@
           <w:kern w:val="0"/>
           <w:lang w:bidi="ar"/>
         </w:rPr>
-        <w:t xml:space="preserve">sets</w:t>
-      </w:r>
-      <w:r>
-        <w:rPr>
-          <w:rFonts w:ascii="Times New Roman" w:eastAsia="Times New Roman" w:hAnsi="Times New Roman" w:cs="Times New Roman"/>
-          <w:color w:val="1B1C1D"/>
-          <w:kern w:val="0"/>
-          <w:lang w:bidi="ar"/>
-        </w:rPr>
-        <w:t xml:space="preserve">, paired-analysis baseline grades were used in </w:t>
-      </w:r>
-      <w:r>
-        <w:rPr>
-          <w:rFonts w:ascii="Times New Roman" w:eastAsia="Times New Roman" w:hAnsi="Times New Roman" w:cs="Times New Roman"/>
-          <w:color w:val="1B1C1D"/>
-          <w:kern w:val="0"/>
-          <w:lang w:bidi="ar"/>
-        </w:rPr>
-        <w:t xml:space="preserve">both.</w:t>
+        <w:t xml:space="preserve">sets)</w:t>
+      </w:r>
+      <w:r>
+        <w:rPr>
+          <w:rFonts w:ascii="Times New Roman" w:eastAsia="Times New Roman" w:hAnsi="Times New Roman" w:cs="Times New Roman"/>
+          <w:color w:val="1B1C1D"/>
+          <w:kern w:val="0"/>
+          <w:lang w:bidi="ar"/>
+        </w:rPr>
+        <w:t xml:space="preserve">, paired-analysis baseline grades were used in both </w:t>
+      </w:r>
+      <w:r>
+        <w:rPr>
+          <w:rFonts w:ascii="Times New Roman" w:eastAsia="Times New Roman" w:hAnsi="Times New Roman" w:cs="Times New Roman"/>
+          <w:color w:val="1B1C1D"/>
+          <w:kern w:val="0"/>
+          <w:lang w:bidi="ar"/>
+        </w:rPr>
+        <w:t xml:space="preserve">sets.</w:t>
       </w:r>
     </w:p>
     <w:p>
@@ -25461,678 +25755,7 @@
           <w:kern w:val="0"/>
           <w:lang w:bidi="ar"/>
         </w:rPr>
-        <w:t xml:space="preserve">Flow of the </w:t>
-      </w:r>
-      <w:r>
-        <w:rPr>
-          <w:rFonts w:ascii="Times New Roman" w:eastAsia="Times New Roman" w:hAnsi="Times New Roman" w:cs="Times New Roman" w:hint="eastAsia"/>
-          <w:i/>
-          <w:iCs/>
-          <w:color w:val="1B1C1D"/>
-          <w:kern w:val="0"/>
-          <w:lang w:bidi="ar"/>
-        </w:rPr>
-        <w:t xml:space="preserve">study</w:t>
-      </w:r>
-      <w:r>
-        <w:rPr>
-          <w:rFonts w:ascii="Times New Roman" w:eastAsia="Times New Roman" w:hAnsi="Times New Roman" w:cs="Times New Roman" w:hint="eastAsia"/>
-          <w:i/>
-          <w:iCs/>
-          <w:color w:val="1B1C1D"/>
-          <w:kern w:val="0"/>
-          <w:lang w:bidi="ar"/>
-        </w:rPr>
-        <w:t xml:space="preserve"> </w:t>
-      </w:r>
-      <w:r>
-        <w:rPr>
-          <w:rFonts w:ascii="Times New Roman" w:eastAsia="Times New Roman" w:hAnsi="Times New Roman" w:cs="Times New Roman" w:hint="eastAsia"/>
-          <w:i/>
-          <w:iCs/>
-          <w:color w:val="1B1C1D"/>
-          <w:kern w:val="0"/>
-          <w:lang w:bidi="ar"/>
-        </w:rPr>
-        <w:t xml:space="preserve">population:</w:t>
-      </w:r>
-      <w:r>
-        <w:rPr>
-          <w:rFonts w:ascii="Times New Roman" w:eastAsia="Times New Roman" w:hAnsi="Times New Roman" w:cs="Times New Roman" w:hint="eastAsia"/>
-          <w:i/>
-          <w:iCs/>
-          <w:color w:val="1B1C1D"/>
-          <w:kern w:val="0"/>
-          <w:lang w:bidi="ar"/>
-        </w:rPr>
-        <w:t xml:space="preserve"> patients </w:t>
-      </w:r>
-      <w:r>
-        <w:rPr>
-          <w:rFonts w:ascii="Times New Roman" w:eastAsia="Times New Roman" w:hAnsi="Times New Roman" w:cs="Times New Roman" w:hint="eastAsia"/>
-          <w:i/>
-          <w:iCs/>
-          <w:color w:val="1B1C1D"/>
-          <w:kern w:val="0"/>
-          <w:lang w:bidi="ar"/>
-        </w:rPr>
-        <w:t xml:space="preserve">undergoing</w:t>
-      </w:r>
-      <w:r>
-        <w:rPr>
-          <w:rFonts w:ascii="Times New Roman" w:eastAsia="Times New Roman" w:hAnsi="Times New Roman" w:cs="Times New Roman" w:hint="eastAsia"/>
-          <w:i/>
-          <w:iCs/>
-          <w:color w:val="1B1C1D"/>
-          <w:kern w:val="0"/>
-          <w:lang w:bidi="ar"/>
-        </w:rPr>
-        <w:t xml:space="preserve"> AF ablation </w:t>
-      </w:r>
-      <w:r>
-        <w:rPr>
-          <w:rFonts w:ascii="Times New Roman" w:eastAsia="Times New Roman" w:hAnsi="Times New Roman" w:cs="Times New Roman" w:hint="eastAsia"/>
-          <w:i/>
-          <w:iCs/>
-          <w:color w:val="1B1C1D"/>
-          <w:kern w:val="0"/>
-          <w:lang w:bidi="ar"/>
-        </w:rPr>
-        <w:t xml:space="preserve">between</w:t>
-      </w:r>
-      <w:r>
-        <w:rPr>
-          <w:rFonts w:ascii="Times New Roman" w:eastAsia="Times New Roman" w:hAnsi="Times New Roman" w:cs="Times New Roman" w:hint="eastAsia"/>
-          <w:i/>
-          <w:iCs/>
-          <w:color w:val="1B1C1D"/>
-          <w:kern w:val="0"/>
-          <w:lang w:bidi="ar"/>
-        </w:rPr>
-        <w:t xml:space="preserve"> </w:t>
-      </w:r>
-      <w:r>
-        <w:rPr>
-          <w:rFonts w:ascii="Times New Roman" w:eastAsia="Times New Roman" w:hAnsi="Times New Roman" w:cs="Times New Roman" w:hint="eastAsia"/>
-          <w:i/>
-          <w:iCs/>
-          <w:color w:val="1B1C1D"/>
-          <w:kern w:val="0"/>
-          <w:lang w:bidi="ar"/>
-        </w:rPr>
-        <w:t xml:space="preserve">January 2020 </w:t>
-      </w:r>
-      <w:r>
-        <w:rPr>
-          <w:rFonts w:ascii="Times New Roman" w:eastAsia="Times New Roman" w:hAnsi="Times New Roman" w:cs="Times New Roman" w:hint="eastAsia"/>
-          <w:i/>
-          <w:iCs/>
-          <w:color w:val="1B1C1D"/>
-          <w:kern w:val="0"/>
-          <w:lang w:bidi="ar"/>
-        </w:rPr>
-        <w:t xml:space="preserve">and</w:t>
-      </w:r>
-      <w:r>
-        <w:rPr>
-          <w:rFonts w:ascii="Times New Roman" w:eastAsia="Times New Roman" w:hAnsi="Times New Roman" w:cs="Times New Roman" w:hint="eastAsia"/>
-          <w:i/>
-          <w:iCs/>
-          <w:color w:val="1B1C1D"/>
-          <w:kern w:val="0"/>
-          <w:lang w:bidi="ar"/>
-        </w:rPr>
-        <w:t xml:space="preserve"> September 2024</w:t>
-      </w:r>
-      <w:r>
-        <w:rPr>
-          <w:rFonts w:ascii="Times New Roman" w:eastAsia="Times New Roman" w:hAnsi="Times New Roman" w:cs="Times New Roman" w:hint="eastAsia"/>
-          <w:i/>
-          <w:iCs/>
-          <w:color w:val="1B1C1D"/>
-          <w:kern w:val="0"/>
-          <w:lang w:bidi="ar"/>
-        </w:rPr>
-        <w:t xml:space="preserve"> whose index admission</w:t>
-      </w:r>
-      <w:r>
-        <w:rPr>
-          <w:rFonts w:ascii="Times New Roman" w:eastAsia="Times New Roman" w:hAnsi="Times New Roman" w:cs="Times New Roman" w:hint="eastAsia"/>
-          <w:i/>
-          <w:iCs/>
-          <w:color w:val="1B1C1D"/>
-          <w:kern w:val="0"/>
-          <w:lang w:bidi="ar"/>
-        </w:rPr>
-        <w:t xml:space="preserve"> included </w:t>
-      </w:r>
-      <w:r>
-        <w:rPr>
-          <w:rFonts w:ascii="Times New Roman" w:eastAsia="Times New Roman" w:hAnsi="Times New Roman" w:cs="Times New Roman" w:hint="eastAsia"/>
-          <w:i/>
-          <w:iCs/>
-          <w:color w:val="1B1C1D"/>
-          <w:kern w:val="0"/>
-          <w:lang w:bidi="ar"/>
-        </w:rPr>
-        <w:t xml:space="preserve">an in-hospital baseline</w:t>
-      </w:r>
-      <w:r>
-        <w:rPr>
-          <w:rFonts w:ascii="Times New Roman" w:eastAsia="Times New Roman" w:hAnsi="Times New Roman" w:cs="Times New Roman" w:hint="eastAsia"/>
-          <w:i/>
-          <w:iCs/>
-          <w:color w:val="1B1C1D"/>
-          <w:kern w:val="0"/>
-          <w:lang w:bidi="ar"/>
-        </w:rPr>
-        <w:t xml:space="preserve"> TTE </w:t>
-      </w:r>
-      <w:r>
-        <w:rPr>
-          <w:rFonts w:ascii="Times New Roman" w:eastAsia="Times New Roman" w:hAnsi="Times New Roman" w:cs="Times New Roman" w:hint="eastAsia"/>
-          <w:i/>
-          <w:iCs/>
-          <w:color w:val="1B1C1D"/>
-          <w:kern w:val="0"/>
-          <w:lang w:bidi="ar"/>
-        </w:rPr>
-        <w:t xml:space="preserve">report.</w:t>
-      </w:r>
-      <w:r>
-        <w:rPr>
-          <w:rFonts w:ascii="Times New Roman" w:eastAsia="Times New Roman" w:hAnsi="Times New Roman" w:cs="Times New Roman" w:hint="eastAsia"/>
-          <w:i/>
-          <w:iCs/>
-          <w:color w:val="1B1C1D"/>
-          <w:kern w:val="0"/>
-          <w:lang w:bidi="ar"/>
-        </w:rPr>
-        <w:t xml:space="preserve"> </w:t>
-      </w:r>
-      <w:r>
-        <w:rPr>
-          <w:rFonts w:ascii="Times New Roman" w:eastAsia="Times New Roman" w:hAnsi="Times New Roman" w:cs="Times New Roman" w:hint="eastAsia"/>
-          <w:i/>
-          <w:iCs/>
-          <w:color w:val="1B1C1D"/>
-          <w:kern w:val="0"/>
-          <w:lang w:bidi="ar"/>
-        </w:rPr>
-        <w:t xml:space="preserve">Exclusions</w:t>
-      </w:r>
-      <w:r>
-        <w:rPr>
-          <w:rFonts w:ascii="Times New Roman" w:eastAsia="Times New Roman" w:hAnsi="Times New Roman" w:cs="Times New Roman" w:hint="eastAsia"/>
-          <w:i/>
-          <w:iCs/>
-          <w:color w:val="1B1C1D"/>
-          <w:kern w:val="0"/>
-          <w:lang w:bidi="ar"/>
-        </w:rPr>
-        <w:t xml:space="preserve"> </w:t>
-      </w:r>
-      <w:r>
-        <w:rPr>
-          <w:rFonts w:ascii="Times New Roman" w:eastAsia="Times New Roman" w:hAnsi="Times New Roman" w:cs="Times New Roman" w:hint="eastAsia"/>
-          <w:i/>
-          <w:iCs/>
-          <w:color w:val="1B1C1D"/>
-          <w:kern w:val="0"/>
-          <w:lang w:bidi="ar"/>
-        </w:rPr>
-        <w:t xml:space="preserve">were</w:t>
-      </w:r>
-      <w:r>
-        <w:rPr>
-          <w:rFonts w:ascii="Times New Roman" w:eastAsia="Times New Roman" w:hAnsi="Times New Roman" w:cs="Times New Roman" w:hint="eastAsia"/>
-          <w:i/>
-          <w:iCs/>
-          <w:color w:val="1B1C1D"/>
-          <w:kern w:val="0"/>
-          <w:lang w:bidi="ar"/>
-        </w:rPr>
-        <w:t xml:space="preserve"> </w:t>
-      </w:r>
-      <w:r>
-        <w:rPr>
-          <w:rFonts w:ascii="Times New Roman" w:eastAsia="Times New Roman" w:hAnsi="Times New Roman" w:cs="Times New Roman" w:hint="eastAsia"/>
-          <w:i/>
-          <w:iCs/>
-          <w:color w:val="1B1C1D"/>
-          <w:kern w:val="0"/>
-          <w:lang w:bidi="ar"/>
-        </w:rPr>
-        <w:t xml:space="preserve">applied</w:t>
-      </w:r>
-      <w:r>
-        <w:rPr>
-          <w:rFonts w:ascii="Times New Roman" w:eastAsia="Times New Roman" w:hAnsi="Times New Roman" w:cs="Times New Roman" w:hint="eastAsia"/>
-          <w:i/>
-          <w:iCs/>
-          <w:color w:val="1B1C1D"/>
-          <w:kern w:val="0"/>
-          <w:lang w:bidi="ar"/>
-        </w:rPr>
-        <w:t xml:space="preserve"> </w:t>
-      </w:r>
-      <w:r>
-        <w:rPr>
-          <w:rFonts w:ascii="Times New Roman" w:eastAsia="Times New Roman" w:hAnsi="Times New Roman" w:cs="Times New Roman" w:hint="eastAsia"/>
-          <w:i/>
-          <w:iCs/>
-          <w:color w:val="1B1C1D"/>
-          <w:kern w:val="0"/>
-          <w:lang w:bidi="ar"/>
-        </w:rPr>
-        <w:t xml:space="preserve">uniformly</w:t>
-      </w:r>
-      <w:r>
-        <w:rPr>
-          <w:rFonts w:ascii="Times New Roman" w:eastAsia="Times New Roman" w:hAnsi="Times New Roman" w:cs="Times New Roman" w:hint="eastAsia"/>
-          <w:i/>
-          <w:iCs/>
-          <w:color w:val="1B1C1D"/>
-          <w:kern w:val="0"/>
-          <w:lang w:bidi="ar"/>
-        </w:rPr>
-        <w:t xml:space="preserve"> </w:t>
-      </w:r>
-      <w:r>
-        <w:rPr>
-          <w:rFonts w:ascii="Times New Roman" w:eastAsia="Times New Roman" w:hAnsi="Times New Roman" w:cs="Times New Roman" w:hint="eastAsia"/>
-          <w:i/>
-          <w:iCs/>
-          <w:color w:val="1B1C1D"/>
-          <w:kern w:val="0"/>
-          <w:lang w:bidi="ar"/>
-        </w:rPr>
-        <w:t xml:space="preserve">before</w:t>
-      </w:r>
-      <w:r>
-        <w:rPr>
-          <w:rFonts w:ascii="Times New Roman" w:eastAsia="Times New Roman" w:hAnsi="Times New Roman" w:cs="Times New Roman" w:hint="eastAsia"/>
-          <w:i/>
-          <w:iCs/>
-          <w:color w:val="1B1C1D"/>
-          <w:kern w:val="0"/>
-          <w:lang w:bidi="ar"/>
-        </w:rPr>
-        <w:t xml:space="preserve"> the </w:t>
-      </w:r>
-      <w:r>
-        <w:rPr>
-          <w:rFonts w:ascii="Times New Roman" w:eastAsia="Times New Roman" w:hAnsi="Times New Roman" w:cs="Times New Roman" w:hint="eastAsia"/>
-          <w:i/>
-          <w:iCs/>
-          <w:color w:val="1B1C1D"/>
-          <w:kern w:val="0"/>
-          <w:lang w:bidi="ar"/>
-        </w:rPr>
-        <w:t xml:space="preserve">analysis </w:t>
-      </w:r>
-      <w:r>
-        <w:rPr>
-          <w:rFonts w:ascii="Times New Roman" w:eastAsia="Times New Roman" w:hAnsi="Times New Roman" w:cs="Times New Roman" w:hint="eastAsia"/>
-          <w:i/>
-          <w:iCs/>
-          <w:color w:val="1B1C1D"/>
-          <w:kern w:val="0"/>
-          <w:lang w:bidi="ar"/>
-        </w:rPr>
-        <w:t xml:space="preserve">sets</w:t>
-      </w:r>
-      <w:r>
-        <w:rPr>
-          <w:rFonts w:ascii="Times New Roman" w:eastAsia="Times New Roman" w:hAnsi="Times New Roman" w:cs="Times New Roman" w:hint="eastAsia"/>
-          <w:i/>
-          <w:iCs/>
-          <w:color w:val="1B1C1D"/>
-          <w:kern w:val="0"/>
-          <w:lang w:bidi="ar"/>
-        </w:rPr>
-        <w:t xml:space="preserve"> </w:t>
-      </w:r>
-      <w:r>
-        <w:rPr>
-          <w:rFonts w:ascii="Times New Roman" w:eastAsia="Times New Roman" w:hAnsi="Times New Roman" w:cs="Times New Roman" w:hint="eastAsia"/>
-          <w:i/>
-          <w:iCs/>
-          <w:color w:val="1B1C1D"/>
-          <w:kern w:val="0"/>
-          <w:lang w:bidi="ar"/>
-        </w:rPr>
-        <w:t xml:space="preserve">were</w:t>
-      </w:r>
-      <w:r>
-        <w:rPr>
-          <w:rFonts w:ascii="Times New Roman" w:eastAsia="Times New Roman" w:hAnsi="Times New Roman" w:cs="Times New Roman" w:hint="eastAsia"/>
-          <w:i/>
-          <w:iCs/>
-          <w:color w:val="1B1C1D"/>
-          <w:kern w:val="0"/>
-          <w:lang w:bidi="ar"/>
-        </w:rPr>
-        <w:t xml:space="preserve"> </w:t>
-      </w:r>
-      <w:r>
-        <w:rPr>
-          <w:rFonts w:ascii="Times New Roman" w:eastAsia="Times New Roman" w:hAnsi="Times New Roman" w:cs="Times New Roman" w:hint="eastAsia"/>
-          <w:i/>
-          <w:iCs/>
-          <w:color w:val="1B1C1D"/>
-          <w:kern w:val="0"/>
-          <w:lang w:bidi="ar"/>
-        </w:rPr>
-        <w:t xml:space="preserve">defined.</w:t>
-      </w:r>
-      <w:r>
-        <w:rPr>
-          <w:rFonts w:ascii="Times New Roman" w:eastAsia="Times New Roman" w:hAnsi="Times New Roman" w:cs="Times New Roman" w:hint="eastAsia"/>
-          <w:i/>
-          <w:iCs/>
-          <w:color w:val="1B1C1D"/>
-          <w:kern w:val="0"/>
-          <w:lang w:bidi="ar"/>
-        </w:rPr>
-        <w:t xml:space="preserve"> Organic valve disease comprised rheumatic heart disease, mitral stenosis</w:t>
-      </w:r>
-      <w:r>
-        <w:rPr>
-          <w:rFonts w:ascii="Times New Roman" w:eastAsia="Times New Roman" w:hAnsi="Times New Roman" w:cs="Times New Roman" w:hint="eastAsia"/>
-          <w:i/>
-          <w:iCs/>
-          <w:color w:val="1B1C1D"/>
-          <w:kern w:val="0"/>
-          <w:lang w:bidi="ar"/>
-        </w:rPr>
-        <w:t xml:space="preserve">, aortic stenosis of mild-to-moderate or worse, and valve prolapse; congenital heart disease comprised unrepaired atrial septal defect with shunt, residual shunt after repair or closure, and complex congenital heart </w:t>
-      </w:r>
-      <w:r>
-        <w:rPr>
-          <w:rFonts w:ascii="Times New Roman" w:eastAsia="Times New Roman" w:hAnsi="Times New Roman" w:cs="Times New Roman" w:hint="eastAsia"/>
-          <w:i/>
-          <w:iCs/>
-          <w:color w:val="1B1C1D"/>
-          <w:kern w:val="0"/>
-          <w:lang w:bidi="ar"/>
-        </w:rPr>
-        <w:t xml:space="preserve">disease. The baseline phenotype set comprised patients whose baseline TTE report was graded to estimate prevalence</w:t>
-      </w:r>
-      <w:r>
-        <w:rPr>
-          <w:rFonts w:ascii="Times New Roman" w:eastAsia="Times New Roman" w:hAnsi="Times New Roman" w:cs="Times New Roman" w:hint="eastAsia"/>
-          <w:i/>
-          <w:iCs/>
-          <w:color w:val="1B1C1D"/>
-          <w:kern w:val="0"/>
-          <w:lang w:bidi="ar"/>
-        </w:rPr>
-        <w:t xml:space="preserve">; </w:t>
-      </w:r>
-      <w:r>
-        <w:rPr>
-          <w:rFonts w:ascii="Times New Roman" w:eastAsia="Times New Roman" w:hAnsi="Times New Roman" w:cs="Times New Roman" w:hint="eastAsia"/>
-          <w:i/>
-          <w:iCs/>
-          <w:color w:val="1B1C1D"/>
-          <w:kern w:val="0"/>
-          <w:lang w:bidi="ar"/>
-        </w:rPr>
-        <w:t xml:space="preserve">the paired response set comprised procedures with MR and/or TR of analysis grade ≥1 (very mild</w:t>
-      </w:r>
-      <w:r>
-        <w:rPr>
-          <w:rFonts w:ascii="Times New Roman" w:eastAsia="Times New Roman" w:hAnsi="Times New Roman" w:cs="Times New Roman" w:hint="eastAsia"/>
-          <w:i/>
-          <w:iCs/>
-          <w:color w:val="1B1C1D"/>
-          <w:kern w:val="0"/>
-          <w:lang w:bidi="ar"/>
-        </w:rPr>
-        <w:t xml:space="preserve"> or </w:t>
-      </w:r>
-      <w:r>
-        <w:rPr>
-          <w:rFonts w:ascii="Times New Roman" w:eastAsia="Times New Roman" w:hAnsi="Times New Roman" w:cs="Times New Roman" w:hint="eastAsia"/>
-          <w:i/>
-          <w:iCs/>
-          <w:color w:val="1B1C1D"/>
-          <w:kern w:val="0"/>
-          <w:lang w:bidi="ar"/>
-        </w:rPr>
-        <w:t xml:space="preserve">worse)</w:t>
-      </w:r>
-      <w:r>
-        <w:rPr>
-          <w:rFonts w:ascii="Times New Roman" w:eastAsia="Times New Roman" w:hAnsi="Times New Roman" w:cs="Times New Roman" w:hint="eastAsia"/>
-          <w:i/>
-          <w:iCs/>
-          <w:color w:val="1B1C1D"/>
-          <w:kern w:val="0"/>
-          <w:lang w:bidi="ar"/>
-        </w:rPr>
-        <w:t xml:space="preserve"> on </w:t>
-      </w:r>
-      <w:r>
-        <w:rPr>
-          <w:rFonts w:ascii="Times New Roman" w:eastAsia="Times New Roman" w:hAnsi="Times New Roman" w:cs="Times New Roman" w:hint="eastAsia"/>
-          <w:i/>
-          <w:iCs/>
-          <w:color w:val="1B1C1D"/>
-          <w:kern w:val="0"/>
-          <w:lang w:bidi="ar"/>
-        </w:rPr>
-        <w:t xml:space="preserve">the</w:t>
-      </w:r>
-      <w:r>
-        <w:rPr>
-          <w:rFonts w:ascii="Times New Roman" w:eastAsia="Times New Roman" w:hAnsi="Times New Roman" w:cs="Times New Roman" w:hint="eastAsia"/>
-          <w:i/>
-          <w:iCs/>
-          <w:color w:val="1B1C1D"/>
-          <w:kern w:val="0"/>
-          <w:lang w:bidi="ar"/>
-        </w:rPr>
-        <w:t xml:space="preserve"> </w:t>
-      </w:r>
-      <w:r>
-        <w:rPr>
-          <w:rFonts w:ascii="Times New Roman" w:eastAsia="Times New Roman" w:hAnsi="Times New Roman" w:cs="Times New Roman" w:hint="eastAsia"/>
-          <w:i/>
-          <w:iCs/>
-          <w:color w:val="1B1C1D"/>
-          <w:kern w:val="0"/>
-          <w:lang w:bidi="ar"/>
-        </w:rPr>
-        <w:t xml:space="preserve">baseline</w:t>
-      </w:r>
-      <w:r>
-        <w:rPr>
-          <w:rFonts w:ascii="Times New Roman" w:eastAsia="Times New Roman" w:hAnsi="Times New Roman" w:cs="Times New Roman" w:hint="eastAsia"/>
-          <w:i/>
-          <w:iCs/>
-          <w:color w:val="1B1C1D"/>
-          <w:kern w:val="0"/>
-          <w:lang w:bidi="ar"/>
-        </w:rPr>
-        <w:t xml:space="preserve"> </w:t>
-      </w:r>
-      <w:r>
-        <w:rPr>
-          <w:rFonts w:ascii="Times New Roman" w:eastAsia="Times New Roman" w:hAnsi="Times New Roman" w:cs="Times New Roman" w:hint="eastAsia"/>
-          <w:i/>
-          <w:iCs/>
-          <w:color w:val="1B1C1D"/>
-          <w:kern w:val="0"/>
-          <w:lang w:bidi="ar"/>
-        </w:rPr>
-        <w:t xml:space="preserve">TTE</w:t>
-      </w:r>
-      <w:r>
-        <w:rPr>
-          <w:rFonts w:ascii="Times New Roman" w:eastAsia="Times New Roman" w:hAnsi="Times New Roman" w:cs="Times New Roman" w:hint="eastAsia"/>
-          <w:i/>
-          <w:iCs/>
-          <w:color w:val="1B1C1D"/>
-          <w:kern w:val="0"/>
-          <w:lang w:bidi="ar"/>
-        </w:rPr>
-        <w:t xml:space="preserve"> and </w:t>
-      </w:r>
-      <w:r>
-        <w:rPr>
-          <w:rFonts w:ascii="Times New Roman" w:eastAsia="Times New Roman" w:hAnsi="Times New Roman" w:cs="Times New Roman" w:hint="eastAsia"/>
-          <w:i/>
-          <w:iCs/>
-          <w:color w:val="1B1C1D"/>
-          <w:kern w:val="0"/>
-          <w:lang w:bidi="ar"/>
-        </w:rPr>
-        <w:t xml:space="preserve">a</w:t>
-      </w:r>
-      <w:r>
-        <w:rPr>
-          <w:rFonts w:ascii="Times New Roman" w:eastAsia="Times New Roman" w:hAnsi="Times New Roman" w:cs="Times New Roman" w:hint="eastAsia"/>
-          <w:i/>
-          <w:iCs/>
-          <w:color w:val="1B1C1D"/>
-          <w:kern w:val="0"/>
-          <w:lang w:bidi="ar"/>
-        </w:rPr>
-        <w:t xml:space="preserve"> </w:t>
-      </w:r>
-      <w:r>
-        <w:rPr>
-          <w:rFonts w:ascii="Times New Roman" w:eastAsia="Times New Roman" w:hAnsi="Times New Roman" w:cs="Times New Roman" w:hint="eastAsia"/>
-          <w:i/>
-          <w:iCs/>
-          <w:color w:val="1B1C1D"/>
-          <w:kern w:val="0"/>
-          <w:lang w:bidi="ar"/>
-        </w:rPr>
-        <w:t xml:space="preserve">1-month</w:t>
-      </w:r>
-      <w:r>
-        <w:rPr>
-          <w:rFonts w:ascii="Times New Roman" w:eastAsia="Times New Roman" w:hAnsi="Times New Roman" w:cs="Times New Roman" w:hint="eastAsia"/>
-          <w:i/>
-          <w:iCs/>
-          <w:color w:val="1B1C1D"/>
-          <w:kern w:val="0"/>
-          <w:lang w:bidi="ar"/>
-        </w:rPr>
-        <w:t xml:space="preserve"> </w:t>
-      </w:r>
-      <w:r>
-        <w:rPr>
-          <w:rFonts w:ascii="Times New Roman" w:eastAsia="Times New Roman" w:hAnsi="Times New Roman" w:cs="Times New Roman" w:hint="eastAsia"/>
-          <w:i/>
-          <w:iCs/>
-          <w:color w:val="1B1C1D"/>
-          <w:kern w:val="0"/>
-          <w:lang w:bidi="ar"/>
-        </w:rPr>
-        <w:t xml:space="preserve">TTE.</w:t>
-      </w:r>
-      <w:r>
-        <w:rPr>
-          <w:rFonts w:ascii="Times New Roman" w:eastAsia="Times New Roman" w:hAnsi="Times New Roman" w:cs="Times New Roman" w:hint="eastAsia"/>
-          <w:i/>
-          <w:iCs/>
-          <w:color w:val="1B1C1D"/>
-          <w:kern w:val="0"/>
-          <w:lang w:bidi="ar"/>
-        </w:rPr>
-        <w:t xml:space="preserve"> </w:t>
-      </w:r>
-      <w:r>
-        <w:rPr>
-          <w:rFonts w:ascii="Times New Roman" w:eastAsia="Times New Roman" w:hAnsi="Times New Roman" w:cs="Times New Roman" w:hint="eastAsia"/>
-          <w:i/>
-          <w:iCs/>
-          <w:color w:val="1B1C1D"/>
-          <w:kern w:val="0"/>
-          <w:lang w:bidi="ar"/>
-        </w:rPr>
-        <w:t xml:space="preserve">Overall,</w:t>
-      </w:r>
-      <w:r>
-        <w:rPr>
-          <w:rFonts w:ascii="Times New Roman" w:eastAsia="Times New Roman" w:hAnsi="Times New Roman" w:cs="Times New Roman" w:hint="eastAsia"/>
-          <w:i/>
-          <w:iCs/>
-          <w:color w:val="1B1C1D"/>
-          <w:kern w:val="0"/>
-          <w:lang w:bidi="ar"/>
-        </w:rPr>
-        <w:t xml:space="preserve"> </w:t>
-      </w:r>
-      <w:r>
-        <w:rPr>
-          <w:rFonts w:ascii="Times New Roman" w:eastAsia="Times New Roman" w:hAnsi="Times New Roman" w:cs="Times New Roman" w:hint="eastAsia"/>
-          <w:i/>
-          <w:iCs/>
-          <w:color w:val="1B1C1D"/>
-          <w:kern w:val="0"/>
-          <w:lang w:bidi="ar"/>
-        </w:rPr>
-        <w:t xml:space="preserve">372</w:t>
-      </w:r>
-      <w:r>
-        <w:rPr>
-          <w:rFonts w:ascii="Times New Roman" w:eastAsia="Times New Roman" w:hAnsi="Times New Roman" w:cs="Times New Roman" w:hint="eastAsia"/>
-          <w:i/>
-          <w:iCs/>
-          <w:color w:val="1B1C1D"/>
-          <w:kern w:val="0"/>
-          <w:lang w:bidi="ar"/>
-        </w:rPr>
-        <w:t xml:space="preserve"> patients</w:t>
-      </w:r>
-      <w:r>
-        <w:rPr>
-          <w:rFonts w:ascii="Times New Roman" w:eastAsia="Times New Roman" w:hAnsi="Times New Roman" w:cs="Times New Roman" w:hint="eastAsia"/>
-          <w:i/>
-          <w:iCs/>
-          <w:color w:val="1B1C1D"/>
-          <w:kern w:val="0"/>
-          <w:lang w:bidi="ar"/>
-        </w:rPr>
-        <w:t xml:space="preserve"> belonged to both sets</w:t>
-      </w:r>
-      <w:r>
-        <w:rPr>
-          <w:rFonts w:ascii="Times New Roman" w:eastAsia="Times New Roman" w:hAnsi="Times New Roman" w:cs="Times New Roman" w:hint="eastAsia"/>
-          <w:i/>
-          <w:iCs/>
-          <w:color w:val="1B1C1D"/>
-          <w:kern w:val="0"/>
-          <w:lang w:bidi="ar"/>
-        </w:rPr>
-        <w:t xml:space="preserve">, for whom the baseline grades of the paired analysis were used.</w:t>
-      </w:r>
-      <w:r>
-        <w:rPr>
-          <w:rFonts w:ascii="Times New Roman" w:eastAsia="Times New Roman" w:hAnsi="Times New Roman" w:cs="Times New Roman" w:hint="eastAsia"/>
-          <w:i/>
-          <w:iCs/>
-          <w:color w:val="1B1C1D"/>
-          <w:kern w:val="0"/>
-          <w:lang w:bidi="ar"/>
-        </w:rPr>
-        <w:t xml:space="preserve"> Each set was analyzed separately in paroxysmal and persistent AF.</w:t>
-      </w:r>
-      <w:r>
-        <w:rPr>
-          <w:rFonts w:ascii="Times New Roman" w:eastAsia="Times New Roman" w:hAnsi="Times New Roman" w:cs="Times New Roman" w:hint="eastAsia"/>
-          <w:i/>
-          <w:iCs/>
-          <w:color w:val="1B1C1D"/>
-          <w:kern w:val="0"/>
-          <w:lang w:bidi="ar"/>
-        </w:rPr>
-        <w:t xml:space="preserve"> Eligible admissions without a 1-month TTE were compared with included procedures in Supplementary Table S1B. AF indicates atrial fibrillation; HCM, hypertrophic cardiomyopathy; MR, mitral regurgitation; TR, tricuspid regurgitation; TTE, transthoracic echocardiography.</w:t>
+        <w:t xml:space="preserve">Flow of the study population: patients undergoing AF ablation between January 2020 and September 2024 with an in-hospital baseline TTE report. Exclusions were applied uniformly before the analysis sets were defined. Organic valve disease comprised rheumatic heart disease, mitral stenosis, aortic stenosis of mild-to-moderate or worse, and valve prolapse; congenital heart disease comprised unrepaired atrial septal defect with shunt, residual shunt after repair or closure, and complex congenital heart disease. The baseline phenotype set comprised one admission per patient (the first ablation admission in the study period), whose baseline TTE report was graded to estimate prevalence; the paired response set comprised procedures with MR and/or TR of analysis grade ≥1 (very mild or worse) on the baseline TTE and a 1-month TTE. Overall, 372 patients belonged to both sets; for the 366 whose baseline-set admission was a paired procedure, the baseline grades of the paired analysis were used. Each set was analyzed separately in paroxysmal and persistent AF. Eligible admissions without a 1-month TTE were compared with included procedures in Supplementary Table S1B. AF indicates atrial fibrillation; HCM, hypertrophic cardiomyopathy; MR, mitral regurgitation; TR, tricuspid regurgitation; TTE, transthoracic echocardiography.</w:t>
       </w:r>
     </w:p>
     <w:p>
@@ -27380,7 +27003,7 @@
           <w:kern w:val="0"/>
           <w:lang w:bidi="ar"/>
         </w:rPr>
-        <w:t xml:space="preserve"> counts patients (</w:t>
+        <w:t xml:space="preserve"> counts patients (first </w:t>
       </w:r>
       <w:r>
         <w:rPr>
@@ -27391,7 +27014,7 @@
           <w:kern w:val="0"/>
           <w:lang w:bidi="ar"/>
         </w:rPr>
-        <w:t xml:space="preserve">index</w:t>
+        <w:t xml:space="preserve">ablation admission</w:t>
       </w:r>
       <w:r>
         <w:rPr>
@@ -27402,7 +27025,18 @@
           <w:kern w:val="0"/>
           <w:lang w:bidi="ar"/>
         </w:rPr>
-        <w:t xml:space="preserve"> ablation admission) and the paired response </w:t>
+        <w:t xml:space="preserve"> in the study period</w:t>
+      </w:r>
+      <w:r>
+        <w:rPr>
+          <w:rFonts w:ascii="Times New Roman" w:eastAsia="Times New Roman" w:hAnsi="Times New Roman" w:cs="Times New Roman" w:hint="eastAsia"/>
+          <w:i/>
+          <w:iCs/>
+          <w:color w:val="1B1C1D"/>
+          <w:kern w:val="0"/>
+          <w:lang w:bidi="ar"/>
+        </w:rPr>
+        <w:t xml:space="preserve">) and the paired response </w:t>
       </w:r>
       <w:r>
         <w:rPr>

</xml_diff>